<commit_message>
vpscreen-portfolio-threads: Vivek Gautam 14yr/100x post: 7 conviction tags (Timex/Shriram Pistons/Garware/Nuvama/Uno Minda/Acutaas/Privi) + 2 exits (Kernex/Bajaj Consumer); Omkar Motherson playbook entry; discovery+stale-floor clean
Co-Authored-By: Claude Sonnet 5 <noreply@anthropic.com>
</commit_message>
<xml_diff>
--- a/projects/valuepickr-open-screen/docs/Acutaas Chemicals Ltd.docx
+++ b/projects/valuepickr-open-screen/docs/Acutaas Chemicals Ltd.docx
@@ -32,7 +32,7 @@
           <w:sz w:val="22"/>
           <w:szCs w:val="22"/>
         </w:rPr>
-        <w:t xml:space="preserve">A genuinely excellent, accelerating three-engine growth story (CDMO, electrolyte additives, semiconductor chemicals) that has already re-rated 129% in a year — the growth is real, but so is the valuation</w:t>
+        <w:t xml:space="preserve">Genuinely excellent, accelerating three-engine chemicals story (pharma CDMO + electrolyte additives + semiconductor chemicals) - but at ~Rs 26k Cr and ~73x earnings, most of a 10x-from-here is already priced in</w:t>
       </w:r>
     </w:p>
     <w:p>
@@ -49,7 +49,7 @@
         <w:spacing w:after="120"/>
       </w:pPr>
       <w:r>
-        <w:t xml:space="preserve">Acutaas Chemicals (renamed from Ami Organics in 2025) manufactures advanced pharmaceutical intermediates and specialty chemicals across three growth engines: a Pharma CDMO business (targeting Rs 1,000 Cr revenue by FY28, up from Rs 80-90 Cr), electrolyte additives for lithium-ion batteries (claims to be the largest manufacturer outside China, positioned for the BESS opportunity), and semiconductor-grade photoresist chemicals via a South Korea JV (commercial production expected late 2026/early 2027).</w:t>
+        <w:t xml:space="preserve">Advanced pharma intermediates and specialty chemicals maker (formerly Ami Organics) building three verticals: pharma CDMO (Fermion/darolutamide anchor), battery electrolyte additives (VC/FEC), and semiconductor photoresist chemicals (South Korea JV, Indichem).</w:t>
       </w:r>
     </w:p>
     <w:p>
@@ -99,142 +99,142 @@
           </w:tcPr>
           <w:p>
             <w:r>
-              <w:t xml:space="preserve">Rs 26,285-30,088 Cr (sources vary; up ~129% in 1 year)</w:t>
-            </w:r>
-          </w:p>
-        </w:tc>
-      </w:tr>
-      <w:tr>
-        <w:tc>
-          <w:tcPr>
-            <w:tcW w:type="dxa" w:w="3200"/>
-            <w:shd w:fill="F2F2F2" w:val="clear"/>
-          </w:tcPr>
-          <w:p>
-            <w:r>
-              <w:rPr>
-                <w:b/>
-                <w:bCs/>
-              </w:rPr>
-              <w:t xml:space="preserve">ROCE</w:t>
-            </w:r>
-          </w:p>
-        </w:tc>
-        <w:tc>
-          <w:tcPr>
-            <w:tcW w:type="dxa" w:w="5800"/>
-          </w:tcPr>
-          <w:p>
-            <w:r>
-              <w:t xml:space="preserve">23.7%</w:t>
-            </w:r>
-          </w:p>
-        </w:tc>
-      </w:tr>
-      <w:tr>
-        <w:tc>
-          <w:tcPr>
-            <w:tcW w:type="dxa" w:w="3200"/>
-            <w:shd w:fill="F2F2F2" w:val="clear"/>
-          </w:tcPr>
-          <w:p>
-            <w:r>
-              <w:rPr>
-                <w:b/>
-                <w:bCs/>
-              </w:rPr>
-              <w:t xml:space="preserve">ROE</w:t>
-            </w:r>
-          </w:p>
-        </w:tc>
-        <w:tc>
-          <w:tcPr>
-            <w:tcW w:type="dxa" w:w="5800"/>
-          </w:tcPr>
-          <w:p>
-            <w:r>
-              <w:t xml:space="preserve">20.9%</w:t>
-            </w:r>
-          </w:p>
-        </w:tc>
-      </w:tr>
-      <w:tr>
-        <w:tc>
-          <w:tcPr>
-            <w:tcW w:type="dxa" w:w="3200"/>
-            <w:shd w:fill="F2F2F2" w:val="clear"/>
-          </w:tcPr>
-          <w:p>
-            <w:r>
-              <w:rPr>
-                <w:b/>
-                <w:bCs/>
-              </w:rPr>
-              <w:t xml:space="preserve">Debt to Equity</w:t>
-            </w:r>
-          </w:p>
-        </w:tc>
-        <w:tc>
-          <w:tcPr>
-            <w:tcW w:type="dxa" w:w="5800"/>
-          </w:tcPr>
-          <w:p>
-            <w:r>
-              <w:t xml:space="preserve">~0.6% (near debt-free)</w:t>
-            </w:r>
-          </w:p>
-        </w:tc>
-      </w:tr>
-      <w:tr>
-        <w:tc>
-          <w:tcPr>
-            <w:tcW w:type="dxa" w:w="3200"/>
-            <w:shd w:fill="F2F2F2" w:val="clear"/>
-          </w:tcPr>
-          <w:p>
-            <w:r>
-              <w:rPr>
-                <w:b/>
-                <w:bCs/>
-              </w:rPr>
-              <w:t xml:space="preserve">P/E</w:t>
-            </w:r>
-          </w:p>
-        </w:tc>
-        <w:tc>
-          <w:tcPr>
-            <w:tcW w:type="dxa" w:w="5800"/>
-          </w:tcPr>
-          <w:p>
-            <w:r>
-              <w:t xml:space="preserve">~68-84x (rich, sources vary)</w:t>
-            </w:r>
-          </w:p>
-        </w:tc>
-      </w:tr>
-      <w:tr>
-        <w:tc>
-          <w:tcPr>
-            <w:tcW w:type="dxa" w:w="3200"/>
-            <w:shd w:fill="F2F2F2" w:val="clear"/>
-          </w:tcPr>
-          <w:p>
-            <w:r>
-              <w:rPr>
-                <w:b/>
-                <w:bCs/>
-              </w:rPr>
-              <w:t xml:space="preserve">FY26 results</w:t>
-            </w:r>
-          </w:p>
-        </w:tc>
-        <w:tc>
-          <w:tcPr>
-            <w:tcW w:type="dxa" w:w="5800"/>
-          </w:tcPr>
-          <w:p>
-            <w:r>
-              <w:t xml:space="preserve">PAT more than doubled YoY to Rs 356.4 Cr, revenue +33% to Rs 1,339.4 Cr, Q4 EBITDA margin 42.4%</w:t>
+              <w:t xml:space="preserve">~Rs 25,900 Cr (large-cap; up ~125% in 1 year)</w:t>
+            </w:r>
+          </w:p>
+        </w:tc>
+      </w:tr>
+      <w:tr>
+        <w:tc>
+          <w:tcPr>
+            <w:tcW w:type="dxa" w:w="3200"/>
+            <w:shd w:fill="F2F2F2" w:val="clear"/>
+          </w:tcPr>
+          <w:p>
+            <w:r>
+              <w:rPr>
+                <w:b/>
+                <w:bCs/>
+              </w:rPr>
+              <w:t xml:space="preserve">Q4 FY26 revenue</w:t>
+            </w:r>
+          </w:p>
+        </w:tc>
+        <w:tc>
+          <w:tcPr>
+            <w:tcW w:type="dxa" w:w="5800"/>
+          </w:tcPr>
+          <w:p>
+            <w:r>
+              <w:t xml:space="preserve">Rs 433 Cr, +40.3% YoY</w:t>
+            </w:r>
+          </w:p>
+        </w:tc>
+      </w:tr>
+      <w:tr>
+        <w:tc>
+          <w:tcPr>
+            <w:tcW w:type="dxa" w:w="3200"/>
+            <w:shd w:fill="F2F2F2" w:val="clear"/>
+          </w:tcPr>
+          <w:p>
+            <w:r>
+              <w:rPr>
+                <w:b/>
+                <w:bCs/>
+              </w:rPr>
+              <w:t xml:space="preserve">Q4 FY26 PAT</w:t>
+            </w:r>
+          </w:p>
+        </w:tc>
+        <w:tc>
+          <w:tcPr>
+            <w:tcW w:type="dxa" w:w="5800"/>
+          </w:tcPr>
+          <w:p>
+            <w:r>
+              <w:t xml:space="preserve">Rs 134 Cr, +114% YoY; PAT margin ~31%; Q4 EBITDA margin ~42%</w:t>
+            </w:r>
+          </w:p>
+        </w:tc>
+      </w:tr>
+      <w:tr>
+        <w:tc>
+          <w:tcPr>
+            <w:tcW w:type="dxa" w:w="3200"/>
+            <w:shd w:fill="F2F2F2" w:val="clear"/>
+          </w:tcPr>
+          <w:p>
+            <w:r>
+              <w:rPr>
+                <w:b/>
+                <w:bCs/>
+              </w:rPr>
+              <w:t xml:space="preserve">FY26 revenue / PAT</w:t>
+            </w:r>
+          </w:p>
+        </w:tc>
+        <w:tc>
+          <w:tcPr>
+            <w:tcW w:type="dxa" w:w="5800"/>
+          </w:tcPr>
+          <w:p>
+            <w:r>
+              <w:t xml:space="preserve">Rs 1,339 Cr (+33%) / Rs 356 Cr (+122%)</w:t>
+            </w:r>
+          </w:p>
+        </w:tc>
+      </w:tr>
+      <w:tr>
+        <w:tc>
+          <w:tcPr>
+            <w:tcW w:type="dxa" w:w="3200"/>
+            <w:shd w:fill="F2F2F2" w:val="clear"/>
+          </w:tcPr>
+          <w:p>
+            <w:r>
+              <w:rPr>
+                <w:b/>
+                <w:bCs/>
+              </w:rPr>
+              <w:t xml:space="preserve">Valuation</w:t>
+            </w:r>
+          </w:p>
+        </w:tc>
+        <w:tc>
+          <w:tcPr>
+            <w:tcW w:type="dxa" w:w="5800"/>
+          </w:tcPr>
+          <w:p>
+            <w:r>
+              <w:t xml:space="preserve">~68-84x earnings (P/E ~73x on FY26)</w:t>
+            </w:r>
+          </w:p>
+        </w:tc>
+      </w:tr>
+      <w:tr>
+        <w:tc>
+          <w:tcPr>
+            <w:tcW w:type="dxa" w:w="3200"/>
+            <w:shd w:fill="F2F2F2" w:val="clear"/>
+          </w:tcPr>
+          <w:p>
+            <w:r>
+              <w:rPr>
+                <w:b/>
+                <w:bCs/>
+              </w:rPr>
+              <w:t xml:space="preserve">FY27 guidance</w:t>
+            </w:r>
+          </w:p>
+        </w:tc>
+        <w:tc>
+          <w:tcPr>
+            <w:tcW w:type="dxa" w:w="5800"/>
+          </w:tcPr>
+          <w:p>
+            <w:r>
+              <w:t xml:space="preserve">~25% revenue growth, margins held near FY26 levels</w:t>
             </w:r>
           </w:p>
         </w:tc>
@@ -250,7 +250,7 @@
         <w:spacing w:after="120"/>
       </w:pPr>
       <w:r>
-        <w:t xml:space="preserve">Genuinely excellent and accelerating recent execution: FY26 PAT more than doubled year-over-year to Rs 356.4 Cr on 33% revenue growth, with Q4 EBITDA margin expanding to 42.4% on product mix. Growth is broad-based across all three engines (CDMO, electrolyte additives, semiconductor chemicals), not reliant on a single driver. However, the stock has already re-rated ~129% in the past year and now trades at a rich ~68-84x P/E — a large part of the growth story appears to already be priced in, and the company has scaled from a small/mid-cap into upper-mid-to-large-cap territory (Rs 26-30k Cr).</w:t>
+        <w:t xml:space="preserve">FY26 execution is genuinely excellent and broad-based: PAT more than doubled, revenue +33%, Q4 EBITDA margin ~42% (pharma ~44%, specialty ~29%). The battery electrolyte-additive capacity (2,000 MT VC+FEC) is sold out on 3-year contracts, and the South Korea semiconductor JV is running ahead of schedule. This is a structural multi-engine expansion, not a single catalyst. But the stock has re-rated ~125% in a year to ~Rs 26k Cr at ~73x earnings, and a 10x from here implies a ~Rs 2.6 lakh Cr outcome.</w:t>
       </w:r>
     </w:p>
     <w:p>
@@ -259,62 +259,7 @@
         <w:spacing w:after="120" w:before="280"/>
       </w:pPr>
       <w:r>
-        <w:t xml:space="preserve">Technical Read (Weekly / Monthly MACD + Bollinger Bands, or RSI/CCI/Williams %R proxy)</w:t>
-      </w:r>
-    </w:p>
-    <w:p>
-      <w:pPr>
-        <w:spacing w:after="120"/>
-      </w:pPr>
-      <w:r>
-        <w:t xml:space="preserve">Not pulled this pass — no browser escalation triggered.</w:t>
-      </w:r>
-    </w:p>
-    <w:p>
-      <w:pPr>
-        <w:pStyle w:val="Heading1"/>
-        <w:spacing w:after="120" w:before="280"/>
-      </w:pPr>
-      <w:r>
-        <w:t xml:space="preserve">ValuePickr Community Signal</w:t>
-      </w:r>
-    </w:p>
-    <w:p>
-      <w:pPr>
-        <w:spacing w:after="120"/>
-      </w:pPr>
-      <w:r>
-        <w:t xml:space="preserve">Read the 50 most recent posts (#64-121, spanning Feb 2024 to Jul 2026) of a very active, deeply-diligenced thread with extensive trusted-user engagement (Chandragupta, Gautam_Chopra, sougataG, PRATEEK_CHANDRA, hnk_so, vikasbargale all elevated-tier). Chandragupta (trusted) has been a consistent, critically-minded voice — flagging both the Baba Fine Chem acquisition's underperformance relative to management's original promises (single-customer concentration risk materialized) and, more recently (May 2026), that management has been 'a little secretive' about the identity of its South Korea semiconductor JV partner.</w:t>
-      </w:r>
-    </w:p>
-    <w:p>
-      <w:pPr>
-        <w:spacing w:after="120"/>
-      </w:pPr>
-      <w:r>
-        <w:rPr>
-          <w:b/>
-          <w:bCs/>
-          <w:sz w:val="20"/>
-          <w:szCs w:val="20"/>
-        </w:rPr>
-        <w:t xml:space="preserve">High-conviction call from a top contributor: </w:t>
-      </w:r>
-      <w:r>
-        <w:rPr>
-          <w:sz w:val="20"/>
-          <w:szCs w:val="20"/>
-        </w:rPr>
-        <w:t xml:space="preserve">Per state.json's existing sourcing, Vivek_6954 (trusted) disclosed a long-held, averaged-up position ('invested since long, averaged on upside post good nos in last 2 qtrs'). joinjp2003 (trusted, separate thread) named Acutaas alongside Nuvama as his two largest positions ('largest positions remains Nuvama and Acutaas' — explicit primacy language). Within the company thread, PRATEEK_CHANDRA (trusted, 3-year holder) remains bullish on all three growth engines scaling together, while Chandragupta (trusted) provides the most consistent critical counterweight, including the Baba Fine Chem miss and recent management-transparency concerns around the Korea JV.</w:t>
-      </w:r>
-    </w:p>
-    <w:p>
-      <w:pPr>
-        <w:pStyle w:val="Heading1"/>
-        <w:spacing w:after="120" w:before="280"/>
-      </w:pPr>
-      <w:r>
-        <w:t xml:space="preserve">Trusted-User Signals (Ongoing)</w:t>
+        <w:t xml:space="preserve">Guidance &amp; Expectation Gap</w:t>
       </w:r>
     </w:p>
     <w:p>
@@ -329,12 +274,12 @@
           <w:sz w:val="18"/>
           <w:szCs w:val="18"/>
         </w:rPr>
-        <w:t xml:space="preserve">Every time a trusted user expresses clear conviction on this stock, most recent first — this section accumulates over time, it isn't a one-time snapshot.</w:t>
-      </w:r>
-    </w:p>
-    <w:p>
-      <w:pPr>
-        <w:spacing w:after="100"/>
+        <w:t xml:space="preserve">Management guidance decoded into commitments, graded on the expectation → action → operational → commercial → financial ladder, then compared to what the current price appears to assume. Method: playbook/guidance-and-expectation-gap.md.</w:t>
+      </w:r>
+    </w:p>
+    <w:p>
+      <w:pPr>
+        <w:spacing w:after="120"/>
       </w:pPr>
       <w:r>
         <w:rPr>
@@ -343,8 +288,351 @@
           <w:sz w:val="20"/>
           <w:szCs w:val="20"/>
         </w:rPr>
-        <w:t xml:space="preserve">2026-05-06 — Chandragupta (trusted, elevated-tier)</w:t>
-      </w:r>
+        <w:t xml:space="preserve">Market expectation vs. our path:</w:t>
+      </w:r>
+    </w:p>
+    <w:tbl>
+      <w:tblPr>
+        <w:tblW w:type="dxa" w:w="9000"/>
+        <w:tblBorders>
+          <w:top w:val="single" w:color="auto" w:sz="4"/>
+          <w:left w:val="single" w:color="auto" w:sz="4"/>
+          <w:bottom w:val="single" w:color="auto" w:sz="4"/>
+          <w:right w:val="single" w:color="auto" w:sz="4"/>
+          <w:insideH w:val="single" w:color="auto" w:sz="4"/>
+          <w:insideV w:val="single" w:color="auto" w:sz="4"/>
+        </w:tblBorders>
+      </w:tblPr>
+      <w:tblGrid>
+        <w:gridCol w:w="3200"/>
+        <w:gridCol w:w="5800"/>
+      </w:tblGrid>
+      <w:tr>
+        <w:tc>
+          <w:tcPr>
+            <w:tcW w:type="dxa" w:w="3200"/>
+            <w:shd w:fill="F2F2F2" w:val="clear"/>
+          </w:tcPr>
+          <w:p>
+            <w:r>
+              <w:rPr>
+                <w:b/>
+                <w:bCs/>
+              </w:rPr>
+              <w:t xml:space="preserve">As of</w:t>
+            </w:r>
+          </w:p>
+        </w:tc>
+        <w:tc>
+          <w:tcPr>
+            <w:tcW w:type="dxa" w:w="5800"/>
+          </w:tcPr>
+          <w:p>
+            <w:r>
+              <w:t xml:space="preserve">2026-09-09</w:t>
+            </w:r>
+          </w:p>
+        </w:tc>
+      </w:tr>
+      <w:tr>
+        <w:tc>
+          <w:tcPr>
+            <w:tcW w:type="dxa" w:w="3200"/>
+            <w:shd w:fill="F2F2F2" w:val="clear"/>
+          </w:tcPr>
+          <w:p>
+            <w:r>
+              <w:rPr>
+                <w:b/>
+                <w:bCs/>
+              </w:rPr>
+              <w:t xml:space="preserve">Price / multiple</w:t>
+            </w:r>
+          </w:p>
+        </w:tc>
+        <w:tc>
+          <w:tcPr>
+            <w:tcW w:type="dxa" w:w="5800"/>
+          </w:tcPr>
+          <w:p>
+            <w:r>
+              <w:t xml:space="preserve">Rs 3242 · 68.8x P/E</w:t>
+            </w:r>
+          </w:p>
+        </w:tc>
+      </w:tr>
+      <w:tr>
+        <w:tc>
+          <w:tcPr>
+            <w:tcW w:type="dxa" w:w="3200"/>
+            <w:shd w:fill="F2F2F2" w:val="clear"/>
+          </w:tcPr>
+          <w:p>
+            <w:r>
+              <w:rPr>
+                <w:b/>
+                <w:bCs/>
+              </w:rPr>
+              <w:t xml:space="preserve">Right valuation lens</w:t>
+            </w:r>
+          </w:p>
+        </w:tc>
+        <w:tc>
+          <w:tcPr>
+            <w:tcW w:type="dxa" w:w="5800"/>
+          </w:tcPr>
+          <w:p>
+            <w:r>
+              <w:t xml:space="preserve">P/E</w:t>
+            </w:r>
+          </w:p>
+        </w:tc>
+      </w:tr>
+      <w:tr>
+        <w:tc>
+          <w:tcPr>
+            <w:tcW w:type="dxa" w:w="3200"/>
+            <w:shd w:fill="F2F2F2" w:val="clear"/>
+          </w:tcPr>
+          <w:p>
+            <w:r>
+              <w:rPr>
+                <w:b/>
+                <w:bCs/>
+              </w:rPr>
+              <w:t xml:space="preserve">Price implies</w:t>
+            </w:r>
+          </w:p>
+        </w:tc>
+        <w:tc>
+          <w:tcPr>
+            <w:tcW w:type="dxa" w:w="5800"/>
+          </w:tcPr>
+          <w:p>
+            <w:r>
+              <w:t xml:space="preserve">~35-40% EPS CAGR FY26-28 needed to justify ~69x today against a ~32x high-quality-franchise exit multiple</w:t>
+            </w:r>
+          </w:p>
+        </w:tc>
+      </w:tr>
+      <w:tr>
+        <w:tc>
+          <w:tcPr>
+            <w:tcW w:type="dxa" w:w="3200"/>
+            <w:shd w:fill="F2F2F2" w:val="clear"/>
+          </w:tcPr>
+          <w:p>
+            <w:r>
+              <w:rPr>
+                <w:b/>
+                <w:bCs/>
+              </w:rPr>
+              <w:t xml:space="preserve">Our FY27</w:t>
+            </w:r>
+          </w:p>
+        </w:tc>
+        <w:tc>
+          <w:tcPr>
+            <w:tcW w:type="dxa" w:w="5800"/>
+          </w:tcPr>
+          <w:p>
+            <w:r>
+              <w:t xml:space="preserve">revenue ~25% (management guidance), EBITDA margin held near FY26 ~36%, PAT +25-30%</w:t>
+            </w:r>
+          </w:p>
+        </w:tc>
+      </w:tr>
+      <w:tr>
+        <w:tc>
+          <w:tcPr>
+            <w:tcW w:type="dxa" w:w="3200"/>
+            <w:shd w:fill="F2F2F2" w:val="clear"/>
+          </w:tcPr>
+          <w:p>
+            <w:r>
+              <w:rPr>
+                <w:b/>
+                <w:bCs/>
+              </w:rPr>
+              <w:t xml:space="preserve">Our FY28</w:t>
+            </w:r>
+          </w:p>
+        </w:tc>
+        <w:tc>
+          <w:tcPr>
+            <w:tcW w:type="dxa" w:w="5800"/>
+          </w:tcPr>
+          <w:p>
+            <w:r>
+              <w:t xml:space="preserve">second leg from Korea semiconductor JV + full electrolyte-additive run-rate; ~25-30% revenue/PAT growth</w:t>
+            </w:r>
+          </w:p>
+        </w:tc>
+      </w:tr>
+      <w:tr>
+        <w:tc>
+          <w:tcPr>
+            <w:tcW w:type="dxa" w:w="3200"/>
+            <w:shd w:fill="F2F2F2" w:val="clear"/>
+          </w:tcPr>
+          <w:p>
+            <w:r>
+              <w:rPr>
+                <w:b/>
+                <w:bCs/>
+              </w:rPr>
+              <w:t xml:space="preserve">Gap direction</w:t>
+            </w:r>
+          </w:p>
+        </w:tc>
+        <w:tc>
+          <w:tcPr>
+            <w:tcW w:type="dxa" w:w="5800"/>
+          </w:tcPr>
+          <w:p>
+            <w:r>
+              <w:t xml:space="preserve">over-optimistic</w:t>
+            </w:r>
+          </w:p>
+        </w:tc>
+      </w:tr>
+      <w:tr>
+        <w:tc>
+          <w:tcPr>
+            <w:tcW w:type="dxa" w:w="3200"/>
+            <w:shd w:fill="F2F2F2" w:val="clear"/>
+          </w:tcPr>
+          <w:p>
+            <w:r>
+              <w:rPr>
+                <w:b/>
+                <w:bCs/>
+              </w:rPr>
+              <w:t xml:space="preserve">Gap type</w:t>
+            </w:r>
+          </w:p>
+        </w:tc>
+        <w:tc>
+          <w:tcPr>
+            <w:tcW w:type="dxa" w:w="5800"/>
+          </w:tcPr>
+          <w:p>
+            <w:r>
+              <w:t xml:space="preserve">new_business</w:t>
+            </w:r>
+          </w:p>
+        </w:tc>
+      </w:tr>
+      <w:tr>
+        <w:tc>
+          <w:tcPr>
+            <w:tcW w:type="dxa" w:w="3200"/>
+            <w:shd w:fill="F2F2F2" w:val="clear"/>
+          </w:tcPr>
+          <w:p>
+            <w:r>
+              <w:rPr>
+                <w:b/>
+                <w:bCs/>
+              </w:rPr>
+              <w:t xml:space="preserve">Gap magnitude</w:t>
+            </w:r>
+          </w:p>
+        </w:tc>
+        <w:tc>
+          <w:tcPr>
+            <w:tcW w:type="dxa" w:w="5800"/>
+          </w:tcPr>
+          <w:p>
+            <w:r>
+              <w:t xml:space="preserve">-14% (our FY28 PAT vs implied)</w:t>
+            </w:r>
+          </w:p>
+        </w:tc>
+      </w:tr>
+      <w:tr>
+        <w:tc>
+          <w:tcPr>
+            <w:tcW w:type="dxa" w:w="3200"/>
+            <w:shd w:fill="F2F2F2" w:val="clear"/>
+          </w:tcPr>
+          <w:p>
+            <w:r>
+              <w:rPr>
+                <w:b/>
+                <w:bCs/>
+              </w:rPr>
+              <w:t xml:space="preserve">Gap basis</w:t>
+            </w:r>
+          </w:p>
+        </w:tc>
+        <w:tc>
+          <w:tcPr>
+            <w:tcW w:type="dxa" w:w="5800"/>
+          </w:tcPr>
+          <w:p>
+            <w:r>
+              <w:t xml:space="preserve">FY27 guidance is ~25% revenue growth with margins held; a 69x multiple needs mid-to-high-30s EPS CAGR. Battery-additive (sold out on 3-yr contracts) and Korea semiconductor JV (ahead of schedule) provide upside optionality but are not yet in guided numbers.</w:t>
+            </w:r>
+          </w:p>
+        </w:tc>
+      </w:tr>
+      <w:tr>
+        <w:tc>
+          <w:tcPr>
+            <w:tcW w:type="dxa" w:w="3200"/>
+            <w:shd w:fill="F2F2F2" w:val="clear"/>
+          </w:tcPr>
+          <w:p>
+            <w:r>
+              <w:rPr>
+                <w:b/>
+                <w:bCs/>
+              </w:rPr>
+              <w:t xml:space="preserve">Evidence quality</w:t>
+            </w:r>
+          </w:p>
+        </w:tc>
+        <w:tc>
+          <w:tcPr>
+            <w:tcW w:type="dxa" w:w="5800"/>
+          </w:tcPr>
+          <w:p>
+            <w:r>
+              <w:t xml:space="preserve">moderate</w:t>
+            </w:r>
+          </w:p>
+        </w:tc>
+      </w:tr>
+    </w:tbl>
+    <w:p>
+      <w:pPr>
+        <w:spacing w:after="120"/>
+      </w:pPr>
+      <w:r>
+        <w:rPr>
+          <w:i/>
+          <w:iCs/>
+          <w:color w:val="666666"/>
+          <w:sz w:val="16"/>
+          <w:szCs w:val="16"/>
+        </w:rPr>
+        <w:t xml:space="preserve">no broker consensus; implied path is a reverse-P/E estimate + screener.in forward figures + VP thread view</w:t>
+      </w:r>
+    </w:p>
+    <w:p>
+      <w:pPr>
+        <w:pStyle w:val="Heading1"/>
+        <w:spacing w:after="120" w:before="280"/>
+      </w:pPr>
+      <w:r>
+        <w:t xml:space="preserve">Ishmohit-Lens Checks (value chain · earnings quality · growth trajectory · management · quality metrics · track record · global-signal check)</w:t>
+      </w:r>
+    </w:p>
+    <w:p>
+      <w:pPr>
+        <w:spacing w:after="120"/>
+      </w:pPr>
       <w:r>
         <w:rPr>
           <w:i/>
@@ -353,20 +641,12 @@
           <w:sz w:val="18"/>
           <w:szCs w:val="18"/>
         </w:rPr>
-        <w:t xml:space="preserve"> (Acutaas Chemicals company thread)</w:t>
-      </w:r>
-      <w:r>
-        <w:rPr>
-          <w:sz w:val="20"/>
-          <w:szCs w:val="20"/>
-        </w:rPr>
-        <w:br/>
-        <w:t xml:space="preserve">: Flagged that management has been 'a little secretive' about the identity of the South Korea semiconductor JV partner — a mild governance-transparency caution, following his earlier (Aug 2024) flag on the underperforming Baba Fine Chem acquisition.</w:t>
-      </w:r>
-    </w:p>
-    <w:p>
-      <w:pPr>
-        <w:spacing w:after="100"/>
+        <w:t xml:space="preserve">Extra checks drawn from @ishmohit1 / SOIC methodology (playbook/ishmohit-soic-style.md): where the company sits in its value chain and what the supply side is doing, whether a margin/PAT inflection is structural or a cyclical peak, the rate-of-change of growth vs. what the multiple demands, and management quality as a positive attribute.</w:t>
+      </w:r>
+    </w:p>
+    <w:p>
+      <w:pPr>
+        <w:spacing w:after="120"/>
       </w:pPr>
       <w:r>
         <w:rPr>
@@ -375,8 +655,467 @@
           <w:sz w:val="20"/>
           <w:szCs w:val="20"/>
         </w:rPr>
-        <w:t xml:space="preserve">dated language, post #254 — joinjp2003 (trusted)</w:t>
-      </w:r>
+        <w:t xml:space="preserve">Value chain &amp; supply side:</w:t>
+      </w:r>
+    </w:p>
+    <w:tbl>
+      <w:tblPr>
+        <w:tblW w:type="dxa" w:w="9000"/>
+        <w:tblBorders>
+          <w:top w:val="single" w:color="auto" w:sz="4"/>
+          <w:left w:val="single" w:color="auto" w:sz="4"/>
+          <w:bottom w:val="single" w:color="auto" w:sz="4"/>
+          <w:right w:val="single" w:color="auto" w:sz="4"/>
+          <w:insideH w:val="single" w:color="auto" w:sz="4"/>
+          <w:insideV w:val="single" w:color="auto" w:sz="4"/>
+        </w:tblBorders>
+      </w:tblPr>
+      <w:tblGrid>
+        <w:gridCol w:w="3200"/>
+        <w:gridCol w:w="5800"/>
+      </w:tblGrid>
+      <w:tr>
+        <w:tc>
+          <w:tcPr>
+            <w:tcW w:type="dxa" w:w="3200"/>
+            <w:shd w:fill="F2F2F2" w:val="clear"/>
+          </w:tcPr>
+          <w:p>
+            <w:r>
+              <w:rPr>
+                <w:b/>
+                <w:bCs/>
+              </w:rPr>
+              <w:t xml:space="preserve">Theme</w:t>
+            </w:r>
+          </w:p>
+        </w:tc>
+        <w:tc>
+          <w:tcPr>
+            <w:tcW w:type="dxa" w:w="5800"/>
+          </w:tcPr>
+          <w:p>
+            <w:r>
+              <w:t xml:space="preserve">specialty chemicals: pharma CDMO + battery electrolyte additives + semiconductor materials (China+1 / import substitution)</w:t>
+            </w:r>
+          </w:p>
+        </w:tc>
+      </w:tr>
+      <w:tr>
+        <w:tc>
+          <w:tcPr>
+            <w:tcW w:type="dxa" w:w="3200"/>
+            <w:shd w:fill="F2F2F2" w:val="clear"/>
+          </w:tcPr>
+          <w:p>
+            <w:r>
+              <w:rPr>
+                <w:b/>
+                <w:bCs/>
+              </w:rPr>
+              <w:t xml:space="preserve">This company's position</w:t>
+            </w:r>
+          </w:p>
+        </w:tc>
+        <w:tc>
+          <w:tcPr>
+            <w:tcW w:type="dxa" w:w="5800"/>
+          </w:tcPr>
+          <w:p>
+            <w:r>
+              <w:t xml:space="preserve">advanced-intermediate CDMO supplier (Fermion/darolutamide) plus the largest non-China electrolyte-additive maker and an emerging semiconductor-chemicals producer (Korea JV)</w:t>
+            </w:r>
+          </w:p>
+        </w:tc>
+      </w:tr>
+      <w:tr>
+        <w:tc>
+          <w:tcPr>
+            <w:tcW w:type="dxa" w:w="3200"/>
+            <w:shd w:fill="F2F2F2" w:val="clear"/>
+          </w:tcPr>
+          <w:p>
+            <w:r>
+              <w:rPr>
+                <w:b/>
+                <w:bCs/>
+              </w:rPr>
+              <w:t xml:space="preserve">Bottleneck node (pricing power)</w:t>
+            </w:r>
+          </w:p>
+        </w:tc>
+        <w:tc>
+          <w:tcPr>
+            <w:tcW w:type="dxa" w:w="5800"/>
+          </w:tcPr>
+          <w:p>
+            <w:r>
+              <w:t xml:space="preserve">electrolyte additives (VC/FEC) and high-purity semiconductor chemicals outside China</w:t>
+            </w:r>
+          </w:p>
+        </w:tc>
+      </w:tr>
+      <w:tr>
+        <w:tc>
+          <w:tcPr>
+            <w:tcW w:type="dxa" w:w="3200"/>
+            <w:shd w:fill="F2F2F2" w:val="clear"/>
+          </w:tcPr>
+          <w:p>
+            <w:r>
+              <w:rPr>
+                <w:b/>
+                <w:bCs/>
+              </w:rPr>
+              <w:t xml:space="preserve">Supply-side status</w:t>
+            </w:r>
+          </w:p>
+        </w:tc>
+        <w:tc>
+          <w:tcPr>
+            <w:tcW w:type="dxa" w:w="5800"/>
+          </w:tcPr>
+          <w:p>
+            <w:r>
+              <w:t xml:space="preserve">consolidating</w:t>
+            </w:r>
+          </w:p>
+        </w:tc>
+      </w:tr>
+      <w:tr>
+        <w:tc>
+          <w:tcPr>
+            <w:tcW w:type="dxa" w:w="3200"/>
+            <w:shd w:fill="F2F2F2" w:val="clear"/>
+          </w:tcPr>
+          <w:p>
+            <w:r>
+              <w:rPr>
+                <w:b/>
+                <w:bCs/>
+              </w:rPr>
+              <w:t xml:space="preserve">Adjacent-node peers</w:t>
+            </w:r>
+          </w:p>
+        </w:tc>
+        <w:tc>
+          <w:tcPr>
+            <w:tcW w:type="dxa" w:w="5800"/>
+          </w:tcPr>
+          <w:p>
+            <w:r>
+              <w:t xml:space="preserve">Neuland Laboratories, Laurus Labs (CDMO), Anupam Rasayan, Tatva Chintan / NOCIL (specialty)</w:t>
+            </w:r>
+          </w:p>
+        </w:tc>
+      </w:tr>
+    </w:tbl>
+    <w:p>
+      <w:pPr>
+        <w:spacing w:after="120"/>
+      </w:pPr>
+      <w:r>
+        <w:rPr>
+          <w:color w:val="666666"/>
+          <w:sz w:val="18"/>
+          <w:szCs w:val="18"/>
+        </w:rPr>
+        <w:t xml:space="preserve">For electrolyte additives and semiconductor photoresist chemicals, credible non-China capacity is scarce - Acutaas is one of very few Indian entrants, giving pricing power if it executes; the CDMO leg is more contested.</w:t>
+      </w:r>
+    </w:p>
+    <w:p>
+      <w:pPr>
+        <w:spacing w:after="120"/>
+      </w:pPr>
+      <w:r>
+        <w:rPr>
+          <w:b/>
+          <w:bCs/>
+          <w:sz w:val="20"/>
+          <w:szCs w:val="20"/>
+        </w:rPr>
+        <w:t xml:space="preserve">Quality metrics (ROCE · debt · FCF · margin · capex):</w:t>
+      </w:r>
+    </w:p>
+    <w:tbl>
+      <w:tblPr>
+        <w:tblW w:type="dxa" w:w="9000"/>
+        <w:tblBorders>
+          <w:top w:val="single" w:color="auto" w:sz="4"/>
+          <w:left w:val="single" w:color="auto" w:sz="4"/>
+          <w:bottom w:val="single" w:color="auto" w:sz="4"/>
+          <w:right w:val="single" w:color="auto" w:sz="4"/>
+          <w:insideH w:val="single" w:color="auto" w:sz="4"/>
+          <w:insideV w:val="single" w:color="auto" w:sz="4"/>
+        </w:tblBorders>
+      </w:tblPr>
+      <w:tblGrid>
+        <w:gridCol w:w="3200"/>
+        <w:gridCol w:w="5800"/>
+      </w:tblGrid>
+      <w:tr>
+        <w:tc>
+          <w:tcPr>
+            <w:tcW w:type="dxa" w:w="3200"/>
+            <w:shd w:fill="F2F2F2" w:val="clear"/>
+          </w:tcPr>
+          <w:p>
+            <w:r>
+              <w:rPr>
+                <w:b/>
+                <w:bCs/>
+              </w:rPr>
+              <w:t xml:space="preserve">Assessment</w:t>
+            </w:r>
+          </w:p>
+        </w:tc>
+        <w:tc>
+          <w:tcPr>
+            <w:tcW w:type="dxa" w:w="5800"/>
+          </w:tcPr>
+          <w:p>
+            <w:r>
+              <w:t xml:space="preserve">positive</w:t>
+            </w:r>
+          </w:p>
+        </w:tc>
+      </w:tr>
+      <w:tr>
+        <w:tc>
+          <w:tcPr>
+            <w:tcW w:type="dxa" w:w="3200"/>
+            <w:shd w:fill="F2F2F2" w:val="clear"/>
+          </w:tcPr>
+          <w:p>
+            <w:r>
+              <w:rPr>
+                <w:b/>
+                <w:bCs/>
+              </w:rPr>
+              <w:t xml:space="preserve">ROCE</w:t>
+            </w:r>
+          </w:p>
+        </w:tc>
+        <w:tc>
+          <w:tcPr>
+            <w:tcW w:type="dxa" w:w="5800"/>
+          </w:tcPr>
+          <w:p>
+            <w:r>
+              <w:t xml:space="preserve">31.6% (improving)</w:t>
+            </w:r>
+          </w:p>
+        </w:tc>
+      </w:tr>
+      <w:tr>
+        <w:tc>
+          <w:tcPr>
+            <w:tcW w:type="dxa" w:w="3200"/>
+            <w:shd w:fill="F2F2F2" w:val="clear"/>
+          </w:tcPr>
+          <w:p>
+            <w:r>
+              <w:rPr>
+                <w:b/>
+                <w:bCs/>
+              </w:rPr>
+              <w:t xml:space="preserve">Leverage</w:t>
+            </w:r>
+          </w:p>
+        </w:tc>
+        <w:tc>
+          <w:tcPr>
+            <w:tcW w:type="dxa" w:w="5800"/>
+          </w:tcPr>
+          <w:p>
+            <w:r>
+              <w:t xml:space="preserve">Net debt/EBITDA 0x</w:t>
+            </w:r>
+          </w:p>
+        </w:tc>
+      </w:tr>
+      <w:tr>
+        <w:tc>
+          <w:tcPr>
+            <w:tcW w:type="dxa" w:w="3200"/>
+            <w:shd w:fill="F2F2F2" w:val="clear"/>
+          </w:tcPr>
+          <w:p>
+            <w:r>
+              <w:rPr>
+                <w:b/>
+                <w:bCs/>
+              </w:rPr>
+              <w:t xml:space="preserve">FCF conversion</w:t>
+            </w:r>
+          </w:p>
+        </w:tc>
+        <w:tc>
+          <w:tcPr>
+            <w:tcW w:type="dxa" w:w="5800"/>
+          </w:tcPr>
+          <w:p>
+            <w:r>
+              <w:t xml:space="preserve">-32%</w:t>
+            </w:r>
+          </w:p>
+        </w:tc>
+      </w:tr>
+      <w:tr>
+        <w:tc>
+          <w:tcPr>
+            <w:tcW w:type="dxa" w:w="3200"/>
+            <w:shd w:fill="F2F2F2" w:val="clear"/>
+          </w:tcPr>
+          <w:p>
+            <w:r>
+              <w:rPr>
+                <w:b/>
+                <w:bCs/>
+              </w:rPr>
+              <w:t xml:space="preserve">Margin trend</w:t>
+            </w:r>
+          </w:p>
+        </w:tc>
+        <w:tc>
+          <w:tcPr>
+            <w:tcW w:type="dxa" w:w="5800"/>
+          </w:tcPr>
+          <w:p>
+            <w:r>
+              <w:t xml:space="preserve">expanding</w:t>
+            </w:r>
+          </w:p>
+        </w:tc>
+      </w:tr>
+      <w:tr>
+        <w:tc>
+          <w:tcPr>
+            <w:tcW w:type="dxa" w:w="3200"/>
+            <w:shd w:fill="F2F2F2" w:val="clear"/>
+          </w:tcPr>
+          <w:p>
+            <w:r>
+              <w:rPr>
+                <w:b/>
+                <w:bCs/>
+              </w:rPr>
+              <w:t xml:space="preserve">Capex efficiency</w:t>
+            </w:r>
+          </w:p>
+        </w:tc>
+        <w:tc>
+          <w:tcPr>
+            <w:tcW w:type="dxa" w:w="5800"/>
+          </w:tcPr>
+          <w:p>
+            <w:r>
+              <w:t xml:space="preserve">productive</w:t>
+            </w:r>
+          </w:p>
+        </w:tc>
+      </w:tr>
+    </w:tbl>
+    <w:p>
+      <w:pPr>
+        <w:spacing w:after="60" w:before="120"/>
+      </w:pPr>
+      <w:r>
+        <w:rPr>
+          <w:b/>
+          <w:bCs/>
+          <w:sz w:val="20"/>
+          <w:szCs w:val="20"/>
+        </w:rPr>
+        <w:t xml:space="preserve">Track record (Coffee Can persistence check): </w:t>
+      </w:r>
+      <w:r>
+        <w:rPr>
+          <w:sz w:val="20"/>
+          <w:szCs w:val="20"/>
+        </w:rPr>
+        <w:t xml:space="preserve">cleared revenue growth ≥10% AND ROCE ≥15% in 8 of the last 9 years (consistency_score 89)</w:t>
+      </w:r>
+    </w:p>
+    <w:p>
+      <w:pPr>
+        <w:spacing w:after="120"/>
+      </w:pPr>
+      <w:r>
+        <w:rPr>
+          <w:color w:val="666666"/>
+          <w:sz w:val="18"/>
+          <w:szCs w:val="18"/>
+        </w:rPr>
+        <w:t xml:space="preserve">Screener 10y table FY18-FY26: both rev growth &gt;=10% AND ROCE &gt;=15% cleared in 8 of 9 years; only FY20 failed (0.4% revenue growth). ROCE range 16-34% every year, revenue growth double-digit every year except FY20.</w:t>
+      </w:r>
+    </w:p>
+    <w:p>
+      <w:pPr>
+        <w:pStyle w:val="Heading1"/>
+        <w:spacing w:after="120" w:before="280"/>
+      </w:pPr>
+      <w:r>
+        <w:t xml:space="preserve">Technical Read (Weekly / Monthly MACD + Bollinger Bands, or RSI/CCI/Williams %R proxy)</w:t>
+      </w:r>
+    </w:p>
+    <w:p>
+      <w:pPr>
+        <w:spacing w:after="120"/>
+      </w:pPr>
+      <w:r/>
+    </w:p>
+    <w:p>
+      <w:pPr>
+        <w:pStyle w:val="Heading1"/>
+        <w:spacing w:after="120" w:before="280"/>
+      </w:pPr>
+      <w:r>
+        <w:t xml:space="preserve">ValuePickr Community Signal</w:t>
+      </w:r>
+    </w:p>
+    <w:p>
+      <w:pPr>
+        <w:spacing w:after="120"/>
+      </w:pPr>
+      <w:r>
+        <w:t xml:space="preserve">First deep forum read (recent ~50 posts; low posting volume means this spans 2024-2026). Recent 2026 posts cover the Q4 FY26 record print, the sold-out battery capacity, and the ahead-of-schedule Korea JV. Trusted users engaged constructively - abhay.jain (detailed concall notes, no position), PRATEEK_CHANDRA (invested, tracking 3 years, bullish on the semi/EV optionality), Snowman (interested, not invested), AnkitGadia (positive on CDMO 40%+ margins).</w:t>
+      </w:r>
+    </w:p>
+    <w:p>
+      <w:pPr>
+        <w:spacing w:after="120"/>
+      </w:pPr>
+      <w:r>
+        <w:rPr>
+          <w:b/>
+          <w:bCs/>
+          <w:sz w:val="20"/>
+          <w:szCs w:val="20"/>
+        </w:rPr>
+        <w:t xml:space="preserve">High-conviction call from a top contributor: </w:t>
+      </w:r>
+      <w:r>
+        <w:rPr>
+          <w:sz w:val="20"/>
+          <w:szCs w:val="20"/>
+        </w:rPr>
+        <w:t xml:space="preserve">Chandragupta (elevated, invested) - most recent substantive post (#120, May 2026) flags that management has been 'a little secretive' about the Korea JV partner (later identified via Korean media as ex-Samsung photolithography veteran 'Jay Han' / Han Jae-seong). Two-plus elevated-tier users hold sized positions; no exit calls; the running caution is valuation ('a compelling business at an unforgiving price').</w:t>
+      </w:r>
+    </w:p>
+    <w:p>
+      <w:pPr>
+        <w:pStyle w:val="Heading1"/>
+        <w:spacing w:after="120" w:before="280"/>
+      </w:pPr>
+      <w:r>
+        <w:t xml:space="preserve">Trusted-User Signals (Ongoing)</w:t>
+      </w:r>
+    </w:p>
+    <w:p>
+      <w:pPr>
+        <w:spacing w:after="120"/>
+      </w:pPr>
       <w:r>
         <w:rPr>
           <w:i/>
@@ -385,15 +1124,7 @@
           <w:sz w:val="18"/>
           <w:szCs w:val="18"/>
         </w:rPr>
-        <w:t xml:space="preserve"> (My portfolio updates and investment journey)</w:t>
-      </w:r>
-      <w:r>
-        <w:rPr>
-          <w:sz w:val="20"/>
-          <w:szCs w:val="20"/>
-        </w:rPr>
-        <w:br/>
-        <w:t xml:space="preserve">: Named Acutaas (alongside Nuvama) as his largest position — explicit primacy language.</w:t>
+        <w:t xml:space="preserve">Every time a trusted user expresses clear conviction on this stock, most recent first — this section accumulates over time, it isn't a one-time snapshot.</w:t>
       </w:r>
     </w:p>
     <w:p>
@@ -407,7 +1138,7 @@
           <w:sz w:val="20"/>
           <w:szCs w:val="20"/>
         </w:rPr>
-        <w:t xml:space="preserve">dated language, post #1231 — Vivek_6954 (trusted)</w:t>
+        <w:t xml:space="preserve">2026-09-02 — Vivek_6954</w:t>
       </w:r>
       <w:r>
         <w:rPr>
@@ -425,7 +1156,71 @@
           <w:szCs w:val="20"/>
         </w:rPr>
         <w:br/>
-        <w:t xml:space="preserve">: Long-held position, averaged up on the upside following two strong quarters.</w:t>
+        <w:t xml:space="preserve">: "Timex Sh Piston GHFL Nuvama Nippo n Icici amc Uno Minda Acutaas Privi and more stocks have been holding for long time now n pyramiding as well on some triggers like good results" (post #1245)</w:t>
+      </w:r>
+    </w:p>
+    <w:p>
+      <w:pPr>
+        <w:spacing w:after="100"/>
+      </w:pPr>
+      <w:r>
+        <w:rPr>
+          <w:b/>
+          <w:bCs/>
+          <w:sz w:val="20"/>
+          <w:szCs w:val="20"/>
+        </w:rPr>
+        <w:t xml:space="preserve">2026-04-08 — PRATEEK_CHANDRA</w:t>
+      </w:r>
+      <w:r>
+        <w:rPr>
+          <w:i/>
+          <w:iCs/>
+          <w:color w:val="666666"/>
+          <w:sz w:val="18"/>
+          <w:szCs w:val="18"/>
+        </w:rPr>
+        <w:t xml:space="preserve"> (Acutaas Chemicals (formerly Ami Organics))</w:t>
+      </w:r>
+      <w:r>
+        <w:rPr>
+          <w:sz w:val="20"/>
+          <w:szCs w:val="20"/>
+        </w:rPr>
+        <w:br/>
+        <w:t xml:space="preserve">: Invested, tracked 3 years; bullish that the semiconductor + EV-chemical legs (client locked, trials starting) justify the premium if all three businesses scale - execution to be monitored.</w:t>
+      </w:r>
+    </w:p>
+    <w:p>
+      <w:pPr>
+        <w:spacing w:after="100"/>
+      </w:pPr>
+      <w:r>
+        <w:rPr>
+          <w:b/>
+          <w:bCs/>
+          <w:sz w:val="20"/>
+          <w:szCs w:val="20"/>
+        </w:rPr>
+        <w:t xml:space="preserve">2026-05-06 — Chandragupta</w:t>
+      </w:r>
+      <w:r>
+        <w:rPr>
+          <w:i/>
+          <w:iCs/>
+          <w:color w:val="666666"/>
+          <w:sz w:val="18"/>
+          <w:szCs w:val="18"/>
+        </w:rPr>
+        <w:t xml:space="preserve"> (Acutaas Chemicals (formerly Ami Organics))</w:t>
+      </w:r>
+      <w:r>
+        <w:rPr>
+          <w:sz w:val="20"/>
+          <w:szCs w:val="20"/>
+        </w:rPr>
+        <w:br/>
+        <w:t xml:space="preserve">: Invested; flags management as 'a little secretive' about the Korea semiconductor-JV partner (later identified via Korean media as ex-Samsung photolithography veteran Han Jae-seong / 'Jay Han'). A transparency nitpick, not an exit.</w:t>
       </w:r>
     </w:p>
     <w:p>
@@ -441,9 +1236,7 @@
       <w:pPr>
         <w:spacing w:after="120"/>
       </w:pPr>
-      <w:r>
-        <w:t xml:space="preserve">No SEBI/regulatory action found. Promoter holding has declined from 35.96% to 29.36% (post a Kotak MF stake purchase, May 2025) and further to 36.0% cited elsewhere with a -5.09% 3-year decline — a real, monitored trend, though within the range of normal post-listing promoter dilution rather than a distress signal.</w:t>
-      </w:r>
+      <w:r/>
     </w:p>
     <w:p>
       <w:pPr>
@@ -464,7 +1257,7 @@
         <w:spacing w:after="60"/>
       </w:pPr>
       <w:r>
-        <w:t xml:space="preserve">Genuinely accelerating, broad-based growth across three real engines: Pharma CDMO (targeting ~11x growth to Rs 1,000 Cr by FY28), electrolyte additives (largest ex-China manufacturer, positioned for the BESS opportunity), and semiconductor photoresist chemicals (South Korea JV, commercial production 2026-27)</w:t>
+        <w:t xml:space="preserve">Three credible, distinct structural growth engines (pharma CDMO, electrolyte additives, semiconductor chemicals) - not a single-catalyst story</w:t>
       </w:r>
     </w:p>
     <w:p>
@@ -477,7 +1270,7 @@
         <w:spacing w:after="60"/>
       </w:pPr>
       <w:r>
-        <w:t xml:space="preserve">FY26 delivered genuinely excellent results: PAT more than doubled, revenue +33%, margins expanding meaningfully (Q4 EBITDA margin 42.4%)</w:t>
+        <w:t xml:space="preserve">FY26 PAT +122% with Q4 EBITDA margin ~42%; battery capacity sold out; Korea JV ahead of schedule</w:t>
       </w:r>
     </w:p>
     <w:p>
@@ -490,7 +1283,16 @@
         <w:spacing w:after="60"/>
       </w:pPr>
       <w:r>
-        <w:t xml:space="preserve">Two separate trusted users hold real, sized positions, with one explicitly naming it among his two largest holdings</w:t>
+        <w:t xml:space="preserve">Multiple elevated-tier users hold sized positions</w:t>
+      </w:r>
+    </w:p>
+    <w:p>
+      <w:pPr>
+        <w:pStyle w:val="Heading1"/>
+        <w:spacing w:after="120" w:before="280"/>
+      </w:pPr>
+      <w:r>
+        <w:t xml:space="preserve">Bear Case / Key Risks</w:t>
       </w:r>
     </w:p>
     <w:p>
@@ -503,16 +1305,7 @@
         <w:spacing w:after="60"/>
       </w:pPr>
       <w:r>
-        <w:t xml:space="preserve">Near-debt-free balance sheet funding this multi-engine expansion</w:t>
-      </w:r>
-    </w:p>
-    <w:p>
-      <w:pPr>
-        <w:pStyle w:val="Heading1"/>
-        <w:spacing w:after="120" w:before="280"/>
-      </w:pPr>
-      <w:r>
-        <w:t xml:space="preserve">Bear Case / Key Risks</w:t>
+        <w:t xml:space="preserve">~125% 1-year re-rating to ~Rs 26k Cr at ~73x earnings - much of the growth is already priced</w:t>
       </w:r>
     </w:p>
     <w:p>
@@ -525,7 +1318,7 @@
         <w:spacing w:after="60"/>
       </w:pPr>
       <w:r>
-        <w:t xml:space="preserve">Stock has already re-rated ~129% in a year and trades at a rich ~68-84x P/E — much of the growth story may already be priced in at current levels</w:t>
+        <w:t xml:space="preserve">Size (~Rs 26k Cr) makes a further 10x a very high bar</w:t>
       </w:r>
     </w:p>
     <w:p>
@@ -538,7 +1331,7 @@
         <w:spacing w:after="60"/>
       </w:pPr>
       <w:r>
-        <w:t xml:space="preserve">The company has scaled into upper-mid-to-large-cap territory (Rs 26-30k Cr), raising the bar for what still counts as a '10x from here' outcome</w:t>
+        <w:t xml:space="preserve">Chandragupta flags management secrecy on the Korea JV partner; Baba Fine Chem acquisition underdelivered vs original promises</w:t>
       </w:r>
     </w:p>
     <w:p>
@@ -551,7 +1344,102 @@
         <w:spacing w:after="60"/>
       </w:pPr>
       <w:r>
-        <w:t xml:space="preserve">A trusted user's own critical diligence flagged the Baba Fine Chem acquisition underperforming its original growth promises (single-customer concentration risk materialized), and separately flagged management being 'a little secretive' about the Korea JV partner's identity — real, if mild, execution and transparency concerns</w:t>
+        <w:t xml:space="preserve">Promoter holding trending down over 3 years</w:t>
+      </w:r>
+    </w:p>
+    <w:p>
+      <w:pPr>
+        <w:pStyle w:val="Heading1"/>
+        <w:spacing w:after="120" w:before="280"/>
+      </w:pPr>
+      <w:r>
+        <w:t xml:space="preserve">Market-Cap Tier (informational — not a gate in this project)</w:t>
+      </w:r>
+    </w:p>
+    <w:p>
+      <w:pPr>
+        <w:spacing w:after="120"/>
+      </w:pPr>
+      <w:r>
+        <w:rPr>
+          <w:b/>
+          <w:bCs/>
+        </w:rPr>
+        <w:t xml:space="preserve">Large-cap (~Rs 25,900 Cr)</w:t>
+      </w:r>
+    </w:p>
+    <w:p>
+      <w:pPr>
+        <w:pStyle w:val="Heading1"/>
+        <w:spacing w:after="120" w:before="280"/>
+      </w:pPr>
+      <w:r>
+        <w:t xml:space="preserve">Thesis Fit</w:t>
+      </w:r>
+    </w:p>
+    <w:p>
+      <w:pPr>
+        <w:spacing w:after="120"/>
+      </w:pPr>
+      <w:r>
+        <w:rPr>
+          <w:b/>
+          <w:bCs/>
+          <w:sz w:val="24"/>
+          <w:szCs w:val="24"/>
+        </w:rPr>
+        <w:t xml:space="preserve">neither</w:t>
+      </w:r>
+    </w:p>
+    <w:p>
+      <w:pPr>
+        <w:spacing w:after="120"/>
+      </w:pPr>
+      <w:r>
+        <w:rPr>
+          <w:color w:val="666666"/>
+          <w:sz w:val="20"/>
+          <w:szCs w:val="20"/>
+        </w:rPr>
+        <w:t xml:space="preserve">4-box gate — tailwind: yes · TAM: weak · moat: yes · valuation: no  (score 2.5 / 4)</w:t>
+      </w:r>
+    </w:p>
+    <w:p>
+      <w:pPr>
+        <w:spacing w:after="120"/>
+      </w:pPr>
+      <w:r>
+        <w:rPr>
+          <w:i/>
+          <w:iCs/>
+          <w:color w:val="666666"/>
+          <w:sz w:val="20"/>
+          <w:szCs w:val="20"/>
+        </w:rPr>
+        <w:t xml:space="preserve">Three distinct structural growth engines (CDMO, electrolyte additives, semiconductor chemicals) is a genuine tailwind; verdict explicitly flags this as a 'structural TAM expansion' large-cap exception even though headline size (~Rs25,900cr) blocks a literal 10x — tam weak; largest non-China electrolyte-additive maker w/ sold-out capacity is a real moat; ~73x earnings after a 125% 1yr re-rate already prices much of the growth — valuation no.</w:t>
+      </w:r>
+    </w:p>
+    <w:p>
+      <w:pPr>
+        <w:pStyle w:val="Heading1"/>
+        <w:spacing w:after="120" w:before="280"/>
+      </w:pPr>
+      <w:r>
+        <w:t xml:space="preserve">Verdict</w:t>
+      </w:r>
+    </w:p>
+    <w:p>
+      <w:pPr>
+        <w:spacing w:after="120"/>
+      </w:pPr>
+      <w:r>
+        <w:rPr>
+          <w:b/>
+          <w:bCs/>
+          <w:sz w:val="24"/>
+          <w:szCs w:val="24"/>
+        </w:rPr>
+        <w:t xml:space="preserve">Re-verification: Q4 FY26 confirms genuinely excellent, accelerating three-engine execution, but at ~Rs 26k Cr and ~73x earnings the 10x is largely priced - thesis_fit 'neither' at Medium conviction, with the battery + semiconductor verticals noted as a structural inflection for the max-returns ranking</w:t>
       </w:r>
     </w:p>
     <w:p>
@@ -564,74 +1452,7 @@
         <w:spacing w:after="60"/>
       </w:pPr>
       <w:r>
-        <w:t xml:space="preserve">Promoter holding has trended down over the past few years — a real, monitored pattern even if not yet alarming</w:t>
-      </w:r>
-    </w:p>
-    <w:p>
-      <w:pPr>
-        <w:pStyle w:val="Heading1"/>
-        <w:spacing w:after="120" w:before="280"/>
-      </w:pPr>
-      <w:r>
-        <w:t xml:space="preserve">Market-Cap Tier (informational — not a gate in this project)</w:t>
-      </w:r>
-    </w:p>
-    <w:p>
-      <w:pPr>
-        <w:spacing w:after="120"/>
-      </w:pPr>
-      <w:r>
-        <w:rPr>
-          <w:b/>
-          <w:bCs/>
-        </w:rPr>
-        <w:t xml:space="preserve">mid-cap</w:t>
-      </w:r>
-    </w:p>
-    <w:p>
-      <w:pPr>
-        <w:pStyle w:val="Heading1"/>
-        <w:spacing w:after="120" w:before="280"/>
-      </w:pPr>
-      <w:r>
-        <w:t xml:space="preserve">Thesis Fit</w:t>
-      </w:r>
-    </w:p>
-    <w:p>
-      <w:pPr>
-        <w:spacing w:after="120"/>
-      </w:pPr>
-      <w:r>
-        <w:rPr>
-          <w:b/>
-          <w:bCs/>
-          <w:sz w:val="24"/>
-          <w:szCs w:val="24"/>
-        </w:rPr>
-        <w:t xml:space="preserve">neither</w:t>
-      </w:r>
-    </w:p>
-    <w:p>
-      <w:pPr>
-        <w:pStyle w:val="Heading1"/>
-        <w:spacing w:after="120" w:before="280"/>
-      </w:pPr>
-      <w:r>
-        <w:t xml:space="preserve">Verdict</w:t>
-      </w:r>
-    </w:p>
-    <w:p>
-      <w:pPr>
-        <w:spacing w:after="120"/>
-      </w:pPr>
-      <w:r>
-        <w:rPr>
-          <w:b/>
-          <w:bCs/>
-          <w:sz w:val="24"/>
-          <w:szCs w:val="24"/>
-        </w:rPr>
-        <w:t xml:space="preserve">A genuinely excellent, accelerating three-engine growth story — but the size and valuation have already moved a long way, and a trusted user flags real execution/transparency nitpicks</w:t>
+        <w:t xml:space="preserve">Re-verification stock (Sovrenn lead). The Q4 FY26 datapoint (PAT +114%, OPM ~28% -&gt; ~42%) is verified and reflects broad-based operating leverage across all three verticals - the 'quality' half of the prior verdict is fully reaffirmed.</w:t>
       </w:r>
     </w:p>
     <w:p>
@@ -644,7 +1465,7 @@
         <w:spacing w:after="60"/>
       </w:pPr>
       <w:r>
-        <w:t xml:space="preserve">FY26 execution is genuinely excellent (PAT more than doubled, 33% revenue growth, expanding margins) across three credible, distinct growth engines — this is not a single-catalyst story.</w:t>
+        <w:t xml:space="preserve">Per the large-cap inflection exception, the move into electrolyte additives (largest non-China maker, capacity sold out on 3-year contracts) and semiconductor photoresist chemicals (Korea JV, import-substitution supply-chain play) is a specific structural TAM expansion, not just 'good business' - so it is flagged for the max-returns ranking even though the headline thesis_fit stays 'neither'.</w:t>
       </w:r>
     </w:p>
     <w:p>
@@ -657,33 +1478,7 @@
         <w:spacing w:after="60"/>
       </w:pPr>
       <w:r>
-        <w:t xml:space="preserve">Two trusted users hold real, sized positions, with one naming it among his two largest holdings — a genuine, concrete conviction signal.</w:t>
-      </w:r>
-    </w:p>
-    <w:p>
-      <w:pPr>
-        <w:pStyle w:val="ListParagraph"/>
-        <w:numPr>
-          <w:ilvl w:val="0"/>
-          <w:numId w:val="1"/>
-        </w:numPr>
-        <w:spacing w:after="60"/>
-      </w:pPr>
-      <w:r>
-        <w:t xml:space="preserve">However, the ~129% 1-year re-rating and rich ~68-84x P/E mean a large part of the growth story is likely already reflected in the price, and the company's size (Rs 26-30k Cr) has grown well past where it started when the trusted conviction calls were likely first made.</w:t>
-      </w:r>
-    </w:p>
-    <w:p>
-      <w:pPr>
-        <w:pStyle w:val="ListParagraph"/>
-        <w:numPr>
-          <w:ilvl w:val="0"/>
-          <w:numId w:val="1"/>
-        </w:numPr>
-        <w:spacing w:after="60"/>
-      </w:pPr>
-      <w:r>
-        <w:t xml:space="preserve">A trusted user's own critical diligence (Baba Fine Chem underperformance, Korea JV opacity) adds real, if modest, execution/governance caution. Conviction is set to Medium reflecting genuine quality balanced against valuation and size; thesis_fit is 'neither' given how much of the growth appears already priced in at this scale.</w:t>
+        <w:t xml:space="preserve">On size and valuation math a 10x-in-2-3-years is not credible from ~Rs 26k Cr at ~73x, so thesis_fit stays 'neither'; conviction stays Medium (genuine quality and trusted holders, balanced against valuation, size, promoter-holding drift and the Korea-JV opacity Chandragupta flags). No red flag; no 30-day revisit.</w:t>
       </w:r>
     </w:p>
     <w:p>

</xml_diff>